<commit_message>
Release 3.1.45: sync asset versions, TWA deep links fix, and Play Store docs.
Align all site assets with asset-version.txt 3.1.45; point TWA host to kalanera.gr for Digital Asset Links; add production access and deep-link release documentation.

Co-authored-by: Cursor <cursoragent@cursor.com>
</commit_message>
<xml_diff>
--- a/Test-reports/final-input-playstore-production.docx
+++ b/Test-reports/final-input-playstore-production.docx
@@ -88,7 +88,7 @@
           <w:szCs w:val="20"/>
           <w:highlight w:val="yellow"/>
         </w:rPr>
-        <w:t>Dropdown “How easy to recruit?”</w:t>
+        <w:t xml:space="preserve">Dropdown “How easy to recruit?” </w:t>
       </w:r>
       <w:r>
         <w:rPr>
@@ -99,29 +99,72 @@
           <w:szCs w:val="20"/>
           <w:highlight w:val="yellow"/>
         </w:rPr>
+        <w:t xml:space="preserve">- </w:t>
+      </w:r>
+      <w:r>
+        <w:rPr>
+          <w:i/>
+          <w:iCs/>
+          <w:color w:val="4C94D8" w:themeColor="text2" w:themeTint="80"/>
+          <w:sz w:val="20"/>
+          <w:szCs w:val="20"/>
+          <w:highlight w:val="yellow"/>
+        </w:rPr>
+        <w:t>Easy</w:t>
+      </w:r>
+      <w:r>
+        <w:rPr>
+          <w:i/>
+          <w:iCs/>
+          <w:color w:val="4C94D8" w:themeColor="text2" w:themeTint="80"/>
+          <w:sz w:val="20"/>
+          <w:szCs w:val="20"/>
+        </w:rPr>
         <w:t xml:space="preserve"> </w:t>
       </w:r>
-      <w:r>
-        <w:rPr>
-          <w:i/>
-          <w:iCs/>
-          <w:color w:val="4C94D8" w:themeColor="text2" w:themeTint="80"/>
-          <w:sz w:val="20"/>
-          <w:szCs w:val="20"/>
-          <w:highlight w:val="yellow"/>
-        </w:rPr>
-        <w:t xml:space="preserve">- </w:t>
-      </w:r>
-      <w:r>
-        <w:rPr>
-          <w:i/>
-          <w:iCs/>
-          <w:color w:val="4C94D8" w:themeColor="text2" w:themeTint="80"/>
-          <w:sz w:val="20"/>
-          <w:szCs w:val="20"/>
-          <w:highlight w:val="yellow"/>
-        </w:rPr>
-        <w:t>Easy</w:t>
+    </w:p>
+    <w:p>
+      <w:pPr>
+        <w:ind w:left="720"/>
+        <w:rPr>
+          <w:i/>
+          <w:iCs/>
+          <w:color w:val="4C94D8" w:themeColor="text2" w:themeTint="80"/>
+          <w:sz w:val="20"/>
+          <w:szCs w:val="20"/>
+        </w:rPr>
+      </w:pPr>
+      <w:r>
+        <w:rPr>
+          <w:i/>
+          <w:iCs/>
+          <w:color w:val="4C94D8" w:themeColor="text2" w:themeTint="80"/>
+          <w:sz w:val="20"/>
+          <w:szCs w:val="20"/>
+        </w:rPr>
+        <w:t xml:space="preserve">We recruited testers through a paid testing provider (Testers Community) to get structured feedback across devices and Android versions. </w:t>
+      </w:r>
+    </w:p>
+    <w:p>
+      <w:pPr>
+        <w:ind w:left="720"/>
+        <w:rPr>
+          <w:i/>
+          <w:iCs/>
+          <w:color w:val="4C94D8" w:themeColor="text2" w:themeTint="80"/>
+          <w:sz w:val="20"/>
+          <w:szCs w:val="20"/>
+        </w:rPr>
+      </w:pPr>
+      <w:r>
+        <w:rPr>
+          <w:i/>
+          <w:iCs/>
+          <w:color w:val="4C94D8" w:themeColor="text2" w:themeTint="80"/>
+          <w:sz w:val="20"/>
+          <w:szCs w:val="20"/>
+        </w:rPr>
+        <w:t>In addition to the external testers, I (the developer) ran regular on-device checks throughout the closed test, focusing on technical stability, UI/layout consistency, and alignment between the Play listing and the app.</w:t>
       </w:r>
       <w:r>
         <w:rPr>
@@ -133,6 +176,66 @@
         </w:rPr>
         <w:t xml:space="preserve"> </w:t>
       </w:r>
+      <w:r>
+        <w:rPr>
+          <w:i/>
+          <w:iCs/>
+          <w:color w:val="4C94D8" w:themeColor="text2" w:themeTint="80"/>
+          <w:sz w:val="20"/>
+          <w:szCs w:val="20"/>
+        </w:rPr>
+        <w:t xml:space="preserve">We also </w:t>
+      </w:r>
+      <w:r>
+        <w:rPr>
+          <w:i/>
+          <w:iCs/>
+          <w:color w:val="4C94D8" w:themeColor="text2" w:themeTint="80"/>
+          <w:sz w:val="20"/>
+          <w:szCs w:val="20"/>
+        </w:rPr>
+        <w:t xml:space="preserve">consulted </w:t>
+      </w:r>
+      <w:r>
+        <w:rPr>
+          <w:i/>
+          <w:iCs/>
+          <w:color w:val="4C94D8" w:themeColor="text2" w:themeTint="80"/>
+          <w:sz w:val="20"/>
+          <w:szCs w:val="20"/>
+        </w:rPr>
+        <w:t>a small number of people from our target audience—</w:t>
+      </w:r>
+      <w:r>
+        <w:rPr>
+          <w:i/>
+          <w:iCs/>
+          <w:color w:val="4C94D8" w:themeColor="text2" w:themeTint="80"/>
+          <w:sz w:val="20"/>
+          <w:szCs w:val="20"/>
+        </w:rPr>
+        <w:t>residents</w:t>
+      </w:r>
+      <w:r>
+        <w:rPr>
+          <w:i/>
+          <w:iCs/>
+          <w:color w:val="4C94D8" w:themeColor="text2" w:themeTint="80"/>
+          <w:sz w:val="20"/>
+          <w:szCs w:val="20"/>
+        </w:rPr>
+        <w:t xml:space="preserve">, family </w:t>
+      </w:r>
+      <w:r>
+        <w:rPr>
+          <w:i/>
+          <w:iCs/>
+          <w:color w:val="4C94D8" w:themeColor="text2" w:themeTint="80"/>
+          <w:sz w:val="20"/>
+          <w:szCs w:val="20"/>
+        </w:rPr>
+        <w:t>and visitors familiar with Kala Nera and Pelion—to validate real-world use cases.</w:t>
+      </w:r>
     </w:p>
     <w:p>
       <w:pPr>
@@ -140,134 +243,66 @@
         <w:rPr>
           <w:i/>
           <w:iCs/>
-          <w:color w:val="4C94D8" w:themeColor="text2" w:themeTint="80"/>
-          <w:sz w:val="20"/>
-          <w:szCs w:val="20"/>
-        </w:rPr>
-      </w:pPr>
-      <w:r>
-        <w:rPr>
-          <w:i/>
-          <w:iCs/>
-          <w:color w:val="4C94D8" w:themeColor="text2" w:themeTint="80"/>
-          <w:sz w:val="20"/>
-          <w:szCs w:val="20"/>
-        </w:rPr>
-        <w:t xml:space="preserve">We recruited testers through a paid testing provider (Testers Community) to get structured feedback across devices and Android versions. </w:t>
+          <w:color w:val="EE0000"/>
+          <w:sz w:val="20"/>
+          <w:szCs w:val="20"/>
+        </w:rPr>
+      </w:pPr>
+      <w:r>
+        <w:rPr>
+          <w:i/>
+          <w:iCs/>
+          <w:color w:val="EE0000"/>
+          <w:sz w:val="20"/>
+          <w:szCs w:val="20"/>
+        </w:rPr>
+        <w:t>We used a paid testing provider (Testers Community) for structured feedback on multiple Android devices. I (the developer) also ran on-device checks for stability, UI/layout, and listing accuracy. A few locals and visitors in Kala Nera/Pelion helped validate real use.</w:t>
       </w:r>
     </w:p>
     <w:p>
       <w:pPr>
         <w:ind w:left="720"/>
         <w:rPr>
-          <w:i/>
-          <w:iCs/>
-          <w:color w:val="4C94D8" w:themeColor="text2" w:themeTint="80"/>
-          <w:sz w:val="20"/>
-          <w:szCs w:val="20"/>
-        </w:rPr>
-      </w:pPr>
-      <w:r>
-        <w:rPr>
-          <w:i/>
-          <w:iCs/>
-          <w:color w:val="4C94D8" w:themeColor="text2" w:themeTint="80"/>
-          <w:sz w:val="20"/>
-          <w:szCs w:val="20"/>
-        </w:rPr>
-        <w:t>In addition to the external testers, I (the developer) ran regular on-device checks throughout the closed test, focusing on technical stability, UI/layout consistency, and alignment between the Play listing and the app.</w:t>
-      </w:r>
-      <w:r>
-        <w:rPr>
-          <w:i/>
-          <w:iCs/>
-          <w:color w:val="4C94D8" w:themeColor="text2" w:themeTint="80"/>
-          <w:sz w:val="20"/>
-          <w:szCs w:val="20"/>
-        </w:rPr>
-        <w:t xml:space="preserve"> </w:t>
-      </w:r>
-      <w:r>
-        <w:rPr>
-          <w:i/>
-          <w:iCs/>
-          <w:color w:val="4C94D8" w:themeColor="text2" w:themeTint="80"/>
-          <w:sz w:val="20"/>
-          <w:szCs w:val="20"/>
-        </w:rPr>
-        <w:t xml:space="preserve">We also </w:t>
-      </w:r>
-      <w:r>
-        <w:rPr>
-          <w:i/>
-          <w:iCs/>
-          <w:color w:val="4C94D8" w:themeColor="text2" w:themeTint="80"/>
-          <w:sz w:val="20"/>
-          <w:szCs w:val="20"/>
-        </w:rPr>
-        <w:t xml:space="preserve">consulted </w:t>
-      </w:r>
-      <w:r>
-        <w:rPr>
-          <w:i/>
-          <w:iCs/>
-          <w:color w:val="4C94D8" w:themeColor="text2" w:themeTint="80"/>
-          <w:sz w:val="20"/>
-          <w:szCs w:val="20"/>
-        </w:rPr>
-        <w:t>a small number of people from our target audience—</w:t>
-      </w:r>
-      <w:r>
-        <w:rPr>
-          <w:i/>
-          <w:iCs/>
-          <w:color w:val="4C94D8" w:themeColor="text2" w:themeTint="80"/>
-          <w:sz w:val="20"/>
-          <w:szCs w:val="20"/>
-        </w:rPr>
-        <w:t>residents</w:t>
-      </w:r>
-      <w:r>
-        <w:rPr>
-          <w:i/>
-          <w:iCs/>
-          <w:color w:val="4C94D8" w:themeColor="text2" w:themeTint="80"/>
-          <w:sz w:val="20"/>
-          <w:szCs w:val="20"/>
-        </w:rPr>
-        <w:t xml:space="preserve">, family </w:t>
-      </w:r>
-      <w:r>
-        <w:rPr>
-          <w:i/>
-          <w:iCs/>
-          <w:color w:val="4C94D8" w:themeColor="text2" w:themeTint="80"/>
-          <w:sz w:val="20"/>
-          <w:szCs w:val="20"/>
-        </w:rPr>
-        <w:t>and visitors familiar with Kala Nera and Pelion—to validate real-world use cases.</w:t>
-      </w:r>
-    </w:p>
-    <w:p>
-      <w:pPr>
-        <w:ind w:left="720"/>
-        <w:rPr>
-          <w:i/>
-          <w:iCs/>
-          <w:color w:val="EE0000"/>
-          <w:sz w:val="20"/>
-          <w:szCs w:val="20"/>
-        </w:rPr>
-      </w:pPr>
-      <w:r>
-        <w:rPr>
-          <w:i/>
-          <w:iCs/>
-          <w:color w:val="EE0000"/>
-          <w:sz w:val="20"/>
-          <w:szCs w:val="20"/>
-        </w:rPr>
-        <w:t>We used a paid testing provider (Testers Community) for structured feedback on multiple Android devices. I (the developer) also ran on-device checks for stability, UI/layout, and listing accuracy. A few locals and visitors in Kala Nera/Pelion helped validate real use.</w:t>
+          <w:sz w:val="20"/>
+          <w:szCs w:val="20"/>
+        </w:rPr>
+      </w:pPr>
+      <w:r>
+        <w:rPr>
+          <w:i/>
+          <w:iCs/>
+          <w:color w:val="000000" w:themeColor="text1"/>
+          <w:sz w:val="20"/>
+          <w:szCs w:val="20"/>
+          <w:highlight w:val="green"/>
+        </w:rPr>
+        <w:t xml:space="preserve">Testers joined our closed test via the Play Console opt-in link. I also shared APK builds with family and others for on-device feedback. After our first production decline, this was our 2nd 14-day closed </w:t>
+      </w:r>
+      <w:proofErr w:type="spellStart"/>
+      <w:proofErr w:type="gramStart"/>
+      <w:r>
+        <w:rPr>
+          <w:i/>
+          <w:iCs/>
+          <w:color w:val="000000" w:themeColor="text1"/>
+          <w:sz w:val="20"/>
+          <w:szCs w:val="20"/>
+          <w:highlight w:val="green"/>
+        </w:rPr>
+        <w:t>test.As</w:t>
+      </w:r>
+      <w:proofErr w:type="spellEnd"/>
+      <w:proofErr w:type="gramEnd"/>
+      <w:r>
+        <w:rPr>
+          <w:i/>
+          <w:iCs/>
+          <w:color w:val="000000" w:themeColor="text1"/>
+          <w:sz w:val="20"/>
+          <w:szCs w:val="20"/>
+          <w:highlight w:val="green"/>
+        </w:rPr>
+        <w:t xml:space="preserve"> the developer I ran on-device checks for stability, UI/layout and listing accuracy.</w:t>
       </w:r>
     </w:p>
     <w:p>
@@ -363,142 +398,37 @@
       <w:pPr>
         <w:ind w:left="720"/>
         <w:rPr>
-          <w:i/>
-          <w:iCs/>
-          <w:color w:val="4C94D8" w:themeColor="text2" w:themeTint="80"/>
-          <w:sz w:val="20"/>
-          <w:szCs w:val="20"/>
-        </w:rPr>
-      </w:pPr>
-      <w:r>
-        <w:rPr>
-          <w:i/>
-          <w:iCs/>
-          <w:color w:val="4C94D8" w:themeColor="text2" w:themeTint="80"/>
-          <w:sz w:val="20"/>
-          <w:szCs w:val="20"/>
-        </w:rPr>
-        <w:t xml:space="preserve">Testers actively used the app across its main flows: </w:t>
-      </w:r>
-      <w:r>
-        <w:rPr>
-          <w:i/>
-          <w:iCs/>
-          <w:color w:val="4C94D8" w:themeColor="text2" w:themeTint="80"/>
-          <w:sz w:val="20"/>
-          <w:szCs w:val="20"/>
-        </w:rPr>
-        <w:t>browsing the local business directory by category and area, and category listings on the home screen</w:t>
-      </w:r>
-      <w:r>
-        <w:rPr>
-          <w:i/>
-          <w:iCs/>
-          <w:color w:val="4C94D8" w:themeColor="text2" w:themeTint="80"/>
-          <w:sz w:val="20"/>
-          <w:szCs w:val="20"/>
-        </w:rPr>
-        <w:t xml:space="preserve">, opening business detail pages (call, website, maps), saving favorites, checking </w:t>
-      </w:r>
-      <w:r>
-        <w:rPr>
-          <w:i/>
-          <w:iCs/>
-          <w:color w:val="4C94D8" w:themeColor="text2" w:themeTint="80"/>
-          <w:sz w:val="20"/>
-          <w:szCs w:val="20"/>
-        </w:rPr>
-        <w:t>estimated bus departure times for the Kala Nera stop</w:t>
-      </w:r>
-      <w:r>
-        <w:rPr>
-          <w:i/>
-          <w:iCs/>
-          <w:color w:val="4C94D8" w:themeColor="text2" w:themeTint="80"/>
-          <w:sz w:val="20"/>
-          <w:szCs w:val="20"/>
-        </w:rPr>
-        <w:t xml:space="preserve"> </w:t>
-      </w:r>
-      <w:r>
-        <w:rPr>
-          <w:i/>
-          <w:iCs/>
-          <w:color w:val="4C94D8" w:themeColor="text2" w:themeTint="80"/>
-          <w:sz w:val="20"/>
-          <w:szCs w:val="20"/>
-        </w:rPr>
-        <w:t xml:space="preserve">(direction, day, and time filters), and exploring the Pelion Guide section (flights, regional events, useful numbers, and bus). </w:t>
+          <w:color w:val="EE0000"/>
+          <w:sz w:val="20"/>
+          <w:szCs w:val="20"/>
+        </w:rPr>
+      </w:pPr>
+      <w:r>
+        <w:rPr>
+          <w:color w:val="EE0000"/>
+          <w:sz w:val="20"/>
+          <w:szCs w:val="20"/>
+        </w:rPr>
+        <w:t>Testers used main flows: directory by category/area, business pages (websites, maps), favorites, estimated bus times (Kala Nera stop), Pelion Guide (flights, events, numbers). Usage matched real trips—quick tasks (eat, stay, bus). Some tested all screens; EN/EL checked.</w:t>
       </w:r>
     </w:p>
     <w:p>
       <w:pPr>
         <w:ind w:left="720"/>
         <w:rPr>
-          <w:i/>
-          <w:iCs/>
-          <w:color w:val="4C94D8" w:themeColor="text2" w:themeTint="80"/>
-          <w:sz w:val="20"/>
-          <w:szCs w:val="20"/>
-        </w:rPr>
-      </w:pPr>
-      <w:r>
-        <w:rPr>
-          <w:i/>
-          <w:iCs/>
-          <w:color w:val="4C94D8" w:themeColor="text2" w:themeTint="80"/>
-          <w:sz w:val="20"/>
-          <w:szCs w:val="20"/>
-        </w:rPr>
-        <w:t xml:space="preserve">Usage was largely consistent with how we expect production users to behave—short, task-focused sessions to find a place to eat or stay, plan a bus trip, or look up practical travel information. </w:t>
-      </w:r>
-      <w:r>
-        <w:rPr>
-          <w:i/>
-          <w:iCs/>
-          <w:color w:val="4C94D8" w:themeColor="text2" w:themeTint="80"/>
-          <w:sz w:val="20"/>
-          <w:szCs w:val="20"/>
-        </w:rPr>
-        <w:t>Testers sometimes tested all screens more systematically; real users more often arrive directly for a single task (e.g., restaurant or bus time).</w:t>
-      </w:r>
-      <w:r>
-        <w:rPr>
-          <w:i/>
-          <w:iCs/>
-          <w:color w:val="4C94D8" w:themeColor="text2" w:themeTint="80"/>
-          <w:sz w:val="20"/>
-          <w:szCs w:val="20"/>
-        </w:rPr>
-        <w:t xml:space="preserve"> Some </w:t>
-      </w:r>
-      <w:r>
-        <w:rPr>
-          <w:i/>
-          <w:iCs/>
-          <w:color w:val="4C94D8" w:themeColor="text2" w:themeTint="80"/>
-          <w:sz w:val="20"/>
-          <w:szCs w:val="20"/>
-        </w:rPr>
-        <w:t>testers also explored both English and Greek versions of the app.</w:t>
-      </w:r>
-    </w:p>
-    <w:p>
-      <w:pPr>
-        <w:ind w:left="720"/>
-        <w:rPr>
-          <w:color w:val="EE0000"/>
-          <w:sz w:val="20"/>
-          <w:szCs w:val="20"/>
-        </w:rPr>
-      </w:pPr>
-      <w:r>
-        <w:rPr>
-          <w:color w:val="EE0000"/>
-          <w:sz w:val="20"/>
-          <w:szCs w:val="20"/>
-        </w:rPr>
-        <w:t>Testers used main flows: directory by category/area, business pages (websites, maps), favorites, estimated bus times (Kala Nera stop), Pelion Guide (flights, events, numbers). Usage matched real trips—quick tasks (eat, stay, bus). Some tested all screens; EN/EL checked.</w:t>
+          <w:color w:val="000000" w:themeColor="text1"/>
+          <w:sz w:val="20"/>
+          <w:szCs w:val="20"/>
+        </w:rPr>
+      </w:pPr>
+      <w:r>
+        <w:rPr>
+          <w:color w:val="000000" w:themeColor="text1"/>
+          <w:sz w:val="20"/>
+          <w:szCs w:val="20"/>
+          <w:highlight w:val="green"/>
+        </w:rPr>
+        <w:t>Testers used core flows: directory, business pages, favorites, bus times, Pelion Guide. Not every tester utilized every feature, but all main areas are covered. Usage matched real visitors (short task sessions). Some explored all screens; typical users pick 1-2 features. EN/EL.</w:t>
       </w:r>
     </w:p>
     <w:p>
@@ -517,8 +447,80 @@
           <w:sz w:val="20"/>
           <w:szCs w:val="20"/>
         </w:rPr>
+        <w:t>Finally, summarize the feedback that you received from testers, and let us know how you collected this feedback.</w:t>
+      </w:r>
+    </w:p>
+    <w:p>
+      <w:pPr>
+        <w:ind w:left="720"/>
+        <w:rPr>
+          <w:i/>
+          <w:iCs/>
+          <w:color w:val="4C94D8" w:themeColor="text2" w:themeTint="80"/>
+          <w:sz w:val="20"/>
+          <w:szCs w:val="20"/>
+        </w:rPr>
+      </w:pPr>
+      <w:r>
+        <w:rPr>
+          <w:i/>
+          <w:iCs/>
+          <w:color w:val="4C94D8" w:themeColor="text2" w:themeTint="80"/>
+          <w:sz w:val="20"/>
+          <w:szCs w:val="20"/>
+        </w:rPr>
+        <w:t xml:space="preserve">Feedback: Testers reported strong stability (no critical crashes), clear navigation, and useful core features (directory, favorites, </w:t>
+      </w:r>
+      <w:r>
+        <w:rPr>
+          <w:i/>
+          <w:iCs/>
+          <w:color w:val="4C94D8" w:themeColor="text2" w:themeTint="80"/>
+          <w:sz w:val="20"/>
+          <w:szCs w:val="20"/>
+        </w:rPr>
+        <w:t>estimated bus departure times for</w:t>
+      </w:r>
+      <w:r>
+        <w:rPr>
+          <w:i/>
+          <w:iCs/>
+          <w:color w:val="4C94D8" w:themeColor="text2" w:themeTint="80"/>
+          <w:sz w:val="20"/>
+          <w:szCs w:val="20"/>
+        </w:rPr>
+        <w:t xml:space="preserve"> the</w:t>
+      </w:r>
+      <w:r>
+        <w:rPr>
+          <w:i/>
+          <w:iCs/>
+          <w:color w:val="4C94D8" w:themeColor="text2" w:themeTint="80"/>
+          <w:sz w:val="20"/>
+          <w:szCs w:val="20"/>
+        </w:rPr>
+        <w:t xml:space="preserve"> Kala Nera stop</w:t>
+      </w:r>
+      <w:r>
+        <w:rPr>
+          <w:i/>
+          <w:iCs/>
+          <w:color w:val="4C94D8" w:themeColor="text2" w:themeTint="80"/>
+          <w:sz w:val="20"/>
+          <w:szCs w:val="20"/>
+        </w:rPr>
+        <w:t xml:space="preserve">, Pelion Guide). </w:t>
+      </w:r>
+      <w:r>
+        <w:rPr>
+          <w:i/>
+          <w:iCs/>
+          <w:color w:val="4C94D8" w:themeColor="text2" w:themeTint="80"/>
+          <w:sz w:val="20"/>
+          <w:szCs w:val="20"/>
+        </w:rPr>
         <w:lastRenderedPageBreak/>
-        <w:t>Finally, summarize the feedback that you received from testers, and let us know how you collected this feedback.</w:t>
+        <w:t>Suggestions included improving Play Store discoverability (ASO and listing text), clearer store screenshots, optional first-time tips for new users, and an in-app link to rate the app on Google Play.</w:t>
       </w:r>
     </w:p>
     <w:p>
@@ -540,47 +542,7 @@
           <w:sz w:val="20"/>
           <w:szCs w:val="20"/>
         </w:rPr>
-        <w:t xml:space="preserve">Feedback: Testers reported strong stability (no critical crashes), clear navigation, and useful core features (directory, favorites, </w:t>
-      </w:r>
-      <w:r>
-        <w:rPr>
-          <w:i/>
-          <w:iCs/>
-          <w:color w:val="4C94D8" w:themeColor="text2" w:themeTint="80"/>
-          <w:sz w:val="20"/>
-          <w:szCs w:val="20"/>
-        </w:rPr>
-        <w:t>estimated bus departure times for</w:t>
-      </w:r>
-      <w:r>
-        <w:rPr>
-          <w:i/>
-          <w:iCs/>
-          <w:color w:val="4C94D8" w:themeColor="text2" w:themeTint="80"/>
-          <w:sz w:val="20"/>
-          <w:szCs w:val="20"/>
-        </w:rPr>
-        <w:t xml:space="preserve"> the</w:t>
-      </w:r>
-      <w:r>
-        <w:rPr>
-          <w:i/>
-          <w:iCs/>
-          <w:color w:val="4C94D8" w:themeColor="text2" w:themeTint="80"/>
-          <w:sz w:val="20"/>
-          <w:szCs w:val="20"/>
-        </w:rPr>
-        <w:t xml:space="preserve"> Kala Nera stop</w:t>
-      </w:r>
-      <w:r>
-        <w:rPr>
-          <w:i/>
-          <w:iCs/>
-          <w:color w:val="4C94D8" w:themeColor="text2" w:themeTint="80"/>
-          <w:sz w:val="20"/>
-          <w:szCs w:val="20"/>
-        </w:rPr>
-        <w:t>, Pelion Guide). Suggestions included improving Play Store discoverability (ASO and listing text), clearer store screenshots, optional first-time tips for new users, and an in-app link to rate the app on Google Play.</w:t>
+        <w:t>How we collected it: Structured written reports from the testing provider, plus direct follow-up on usability and store-listing recommendations.</w:t>
       </w:r>
     </w:p>
     <w:p>
@@ -589,28 +551,6 @@
         <w:rPr>
           <w:i/>
           <w:iCs/>
-          <w:color w:val="4C94D8" w:themeColor="text2" w:themeTint="80"/>
-          <w:sz w:val="20"/>
-          <w:szCs w:val="20"/>
-        </w:rPr>
-      </w:pPr>
-      <w:r>
-        <w:rPr>
-          <w:i/>
-          <w:iCs/>
-          <w:color w:val="4C94D8" w:themeColor="text2" w:themeTint="80"/>
-          <w:sz w:val="20"/>
-          <w:szCs w:val="20"/>
-        </w:rPr>
-        <w:t>How we collected it: Structured written reports from the testing provider, plus direct follow-up on usability and store-listing recommendations.</w:t>
-      </w:r>
-    </w:p>
-    <w:p>
-      <w:pPr>
-        <w:ind w:left="720"/>
-        <w:rPr>
-          <w:i/>
-          <w:iCs/>
           <w:color w:val="EE0000"/>
           <w:sz w:val="20"/>
           <w:szCs w:val="20"/>
@@ -635,6 +575,41 @@
         </w:rPr>
       </w:pPr>
       <w:bookmarkStart w:id="1" w:name="part_2"/>
+      <w:r>
+        <w:rPr>
+          <w:i/>
+          <w:iCs/>
+          <w:color w:val="000000" w:themeColor="text1"/>
+          <w:sz w:val="20"/>
+          <w:szCs w:val="20"/>
+          <w:highlight w:val="green"/>
+        </w:rPr>
+        <w:t xml:space="preserve">Stable, no crashes; directory, favorites, bus times and Pelion Guide valued. Minor issues: </w:t>
+      </w:r>
+      <w:proofErr w:type="gramStart"/>
+      <w:r>
+        <w:rPr>
+          <w:i/>
+          <w:iCs/>
+          <w:color w:val="000000" w:themeColor="text1"/>
+          <w:sz w:val="20"/>
+          <w:szCs w:val="20"/>
+          <w:highlight w:val="green"/>
+        </w:rPr>
+        <w:t>install</w:t>
+      </w:r>
+      <w:proofErr w:type="gramEnd"/>
+      <w:r>
+        <w:rPr>
+          <w:i/>
+          <w:iCs/>
+          <w:color w:val="000000" w:themeColor="text1"/>
+          <w:sz w:val="20"/>
+          <w:szCs w:val="20"/>
+          <w:highlight w:val="green"/>
+        </w:rPr>
+        <w:t xml:space="preserve"> help, weather widget, Android 15 layout. Collected via closed-test feedback, APK testers, and my release notes. Fixed across multiple releases; re-tested on release 7.</w:t>
+      </w:r>
       <w:r>
         <w:rPr>
           <w:sz w:val="20"/>
@@ -839,6 +814,45 @@
           <w:szCs w:val="20"/>
         </w:rPr>
         <w:t xml:space="preserve"> and visitors to Pelion, Greece. For finding places to eat, stay and shop, local services, and trip info (estimated bus times at Kala Nera, flights, events, useful numbers). English and Greek.</w:t>
+      </w:r>
+    </w:p>
+    <w:p>
+      <w:pPr>
+        <w:ind w:left="720"/>
+        <w:rPr>
+          <w:color w:val="000000" w:themeColor="text1"/>
+          <w:sz w:val="20"/>
+          <w:szCs w:val="20"/>
+        </w:rPr>
+      </w:pPr>
+      <w:r>
+        <w:rPr>
+          <w:color w:val="000000" w:themeColor="text1"/>
+          <w:sz w:val="20"/>
+          <w:szCs w:val="20"/>
+          <w:highlight w:val="green"/>
+        </w:rPr>
+        <w:t xml:space="preserve">Tourists and residents in Kala Nera, Kato Gatzea, </w:t>
+      </w:r>
+      <w:proofErr w:type="spellStart"/>
+      <w:r>
+        <w:rPr>
+          <w:color w:val="000000" w:themeColor="text1"/>
+          <w:sz w:val="20"/>
+          <w:szCs w:val="20"/>
+          <w:highlight w:val="green"/>
+        </w:rPr>
+        <w:t>Koropi</w:t>
+      </w:r>
+      <w:proofErr w:type="spellEnd"/>
+      <w:r>
+        <w:rPr>
+          <w:color w:val="000000" w:themeColor="text1"/>
+          <w:sz w:val="20"/>
+          <w:szCs w:val="20"/>
+          <w:highlight w:val="green"/>
+        </w:rPr>
+        <w:t xml:space="preserve"> and Pelion visitors (Greece). People finding places to eat, stay and shop, local services, and trip info (bus times, flights, events, numbers). English and Greek.</w:t>
       </w:r>
     </w:p>
     <w:p>
@@ -962,6 +976,49 @@
           <w:numId w:val="1"/>
         </w:numPr>
         <w:rPr>
+          <w:color w:val="EE0000"/>
+          <w:sz w:val="20"/>
+          <w:szCs w:val="20"/>
+          <w:highlight w:val="green"/>
+        </w:rPr>
+      </w:pPr>
+      <w:r>
+        <w:rPr>
+          <w:color w:val="EE0000"/>
+          <w:sz w:val="20"/>
+          <w:szCs w:val="20"/>
+          <w:highlight w:val="green"/>
+        </w:rPr>
+        <w:t>Helps tourists and residents discover local places to eat, stay, shop and contact details; save favorites on device; check estimated Kala Nera bus times (not official KTEL); use Pelion Guide (flights, events, numbers). Play TWA shell for kalanera.gr. Internet required; favorites local. EN/</w:t>
+      </w:r>
+      <w:proofErr w:type="gramStart"/>
+      <w:r>
+        <w:rPr>
+          <w:color w:val="EE0000"/>
+          <w:sz w:val="20"/>
+          <w:szCs w:val="20"/>
+          <w:highlight w:val="green"/>
+        </w:rPr>
+        <w:t>EL.</w:t>
+      </w:r>
+      <w:r>
+        <w:rPr>
+          <w:color w:val="EE0000"/>
+          <w:sz w:val="20"/>
+          <w:szCs w:val="20"/>
+          <w:highlight w:val="green"/>
+        </w:rPr>
+        <w:t>.</w:t>
+      </w:r>
+      <w:proofErr w:type="gramEnd"/>
+    </w:p>
+    <w:p>
+      <w:pPr>
+        <w:numPr>
+          <w:ilvl w:val="1"/>
+          <w:numId w:val="1"/>
+        </w:numPr>
+        <w:rPr>
           <w:sz w:val="20"/>
           <w:szCs w:val="20"/>
         </w:rPr>
@@ -1037,15 +1094,7 @@
           <w:sz w:val="20"/>
           <w:szCs w:val="20"/>
         </w:rPr>
-        <w:t xml:space="preserve"> N</w:t>
-      </w:r>
-      <w:r>
-        <w:rPr>
-          <w:color w:val="4C94D8" w:themeColor="text2" w:themeTint="80"/>
-          <w:sz w:val="20"/>
-          <w:szCs w:val="20"/>
-        </w:rPr>
-        <w:t>iche, location-based guide</w:t>
+        <w:t xml:space="preserve"> Niche, location-based guide</w:t>
       </w:r>
     </w:p>
     <w:p>
@@ -1250,37 +1299,7 @@
           <w:sz w:val="20"/>
           <w:szCs w:val="20"/>
         </w:rPr>
-        <w:t xml:space="preserve"> </w:t>
-      </w:r>
-      <w:r>
-        <w:rPr>
-          <w:i/>
-          <w:iCs/>
-          <w:color w:val="4C94D8" w:themeColor="text2" w:themeTint="80"/>
-          <w:sz w:val="20"/>
-          <w:szCs w:val="20"/>
-        </w:rPr>
-        <w:t>with clear disclaimers and l</w:t>
-      </w:r>
-      <w:r>
-        <w:rPr>
-          <w:i/>
-          <w:iCs/>
-          <w:color w:val="4C94D8" w:themeColor="text2" w:themeTint="80"/>
-          <w:sz w:val="20"/>
-          <w:szCs w:val="20"/>
-        </w:rPr>
-        <w:t>i</w:t>
-      </w:r>
-      <w:r>
-        <w:rPr>
-          <w:i/>
-          <w:iCs/>
-          <w:color w:val="4C94D8" w:themeColor="text2" w:themeTint="80"/>
-          <w:sz w:val="20"/>
-          <w:szCs w:val="20"/>
-        </w:rPr>
-        <w:t>nks to official KTEL information</w:t>
+        <w:t xml:space="preserve"> with clear disclaimers and links to official KTEL information</w:t>
       </w:r>
     </w:p>
     <w:p>
@@ -1509,30 +1528,32 @@
     </w:p>
     <w:p>
       <w:pPr>
+        <w:ind w:left="720"/>
+        <w:rPr>
+          <w:color w:val="000000" w:themeColor="text1"/>
+          <w:sz w:val="20"/>
+          <w:szCs w:val="20"/>
+        </w:rPr>
+      </w:pPr>
+      <w:r>
+        <w:rPr>
+          <w:i/>
+          <w:iCs/>
+          <w:color w:val="000000" w:themeColor="text1"/>
+          <w:sz w:val="20"/>
+          <w:szCs w:val="20"/>
+          <w:highlight w:val="green"/>
+        </w:rPr>
+        <w:t>Shipped releases 4, 6, 7 during closed testing. Business listings via live JSON (n8n fallback) + local cache for offline; UI refresh, favorites fix, bus + KTEL disclaimers, Pelion Guide. Install help, weather widget, Android 15. Updated listing/screenshots.</w:t>
+      </w:r>
+    </w:p>
+    <w:p>
+      <w:pPr>
         <w:numPr>
           <w:ilvl w:val="0"/>
           <w:numId w:val="1"/>
         </w:numPr>
         <w:rPr>
-          <w:sz w:val="20"/>
-          <w:szCs w:val="20"/>
-        </w:rPr>
-      </w:pPr>
-      <w:r>
-        <w:rPr>
-          <w:sz w:val="20"/>
-          <w:szCs w:val="20"/>
-        </w:rPr>
-        <w:t>Describe how you decided that your app or game was ready for production.</w:t>
-      </w:r>
-    </w:p>
-    <w:p>
-      <w:pPr>
-        <w:ind w:left="720"/>
-        <w:rPr>
-          <w:i/>
-          <w:iCs/>
-          <w:color w:val="4C94D8" w:themeColor="text2" w:themeTint="80"/>
           <w:sz w:val="20"/>
           <w:szCs w:val="20"/>
         </w:rPr>
@@ -1667,7 +1688,6 @@
     </w:p>
     <w:p>
       <w:pPr>
-        <w:ind w:left="720"/>
         <w:rPr>
           <w:i/>
           <w:iCs/>
@@ -1683,8 +1703,10 @@
           <w:color w:val="EE0000"/>
           <w:sz w:val="20"/>
           <w:szCs w:val="20"/>
-        </w:rPr>
-        <w:t xml:space="preserve">14+ day closed test, 12+ testers; no critical crashes. Core flows OK: directory (category/area), business pages, favorites, estimated Kala </w:t>
+          <w:highlight w:val="green"/>
+        </w:rPr>
+        <w:lastRenderedPageBreak/>
+        <w:t xml:space="preserve">2nd 14-day closed test after 1st decline; no critical crashes. Core flows OK: directory, business pages, favorites, bus times, Pelion Guide. Feedback addressed; re-tested on release 7. I validated each build on device. </w:t>
       </w:r>
       <w:proofErr w:type="gramStart"/>
       <w:r>
@@ -1694,8 +1716,9 @@
           <w:color w:val="EE0000"/>
           <w:sz w:val="20"/>
           <w:szCs w:val="20"/>
-        </w:rPr>
-        <w:t>Nera bus</w:t>
+          <w:highlight w:val="green"/>
+        </w:rPr>
+        <w:t>Matches Play listing</w:t>
       </w:r>
       <w:proofErr w:type="gramEnd"/>
       <w:r>
@@ -1705,18 +1728,108 @@
           <w:color w:val="EE0000"/>
           <w:sz w:val="20"/>
           <w:szCs w:val="20"/>
-        </w:rPr>
-        <w:t xml:space="preserve"> times, Pelion Guide. Fixed feedback; I validated each build on device. 3.1.x matches Play listing; privacy linked in the app (More) and on kalanera.gr.</w:t>
-      </w:r>
-    </w:p>
-    <w:p>
-      <w:pPr>
-        <w:rPr>
-          <w:color w:val="4C94D8" w:themeColor="text2" w:themeTint="80"/>
-          <w:sz w:val="20"/>
-          <w:szCs w:val="20"/>
-        </w:rPr>
-      </w:pPr>
+          <w:highlight w:val="green"/>
+        </w:rPr>
+        <w:t>; privacy in app (More) and kalanera.gr.</w:t>
+      </w:r>
+    </w:p>
+    <w:p>
+      <w:pPr>
+        <w:rPr>
+          <w:i/>
+          <w:iCs/>
+          <w:color w:val="EE0000"/>
+          <w:sz w:val="20"/>
+          <w:szCs w:val="20"/>
+        </w:rPr>
+      </w:pPr>
+    </w:p>
+    <w:p>
+      <w:pPr>
+        <w:pStyle w:val="ListParagraph"/>
+        <w:numPr>
+          <w:ilvl w:val="0"/>
+          <w:numId w:val="1"/>
+        </w:numPr>
+        <w:rPr>
+          <w:color w:val="4C94D8" w:themeColor="text2" w:themeTint="80"/>
+          <w:sz w:val="20"/>
+          <w:szCs w:val="20"/>
+        </w:rPr>
+      </w:pPr>
+      <w:r>
+        <w:rPr>
+          <w:color w:val="4C94D8" w:themeColor="text2" w:themeTint="80"/>
+          <w:sz w:val="20"/>
+          <w:szCs w:val="20"/>
+        </w:rPr>
+        <w:t>Additional testing</w:t>
+      </w:r>
+    </w:p>
+    <w:p>
+      <w:pPr>
+        <w:pStyle w:val="ListParagraph"/>
+        <w:rPr>
+          <w:color w:val="4C94D8" w:themeColor="text2" w:themeTint="80"/>
+          <w:sz w:val="20"/>
+          <w:szCs w:val="20"/>
+        </w:rPr>
+      </w:pPr>
+      <w:r>
+        <w:rPr>
+          <w:color w:val="4C94D8" w:themeColor="text2" w:themeTint="80"/>
+          <w:sz w:val="20"/>
+          <w:szCs w:val="20"/>
+        </w:rPr>
+        <w:t>Let us know what was different about your latest closed test. Your response will help us to understand if your app is ready to be granted production access.</w:t>
+      </w:r>
+    </w:p>
+    <w:p>
+      <w:pPr>
+        <w:pStyle w:val="ListParagraph"/>
+        <w:rPr>
+          <w:color w:val="4C94D8" w:themeColor="text2" w:themeTint="80"/>
+          <w:sz w:val="20"/>
+          <w:szCs w:val="20"/>
+        </w:rPr>
+      </w:pPr>
+      <w:r>
+        <w:rPr>
+          <w:color w:val="4C94D8" w:themeColor="text2" w:themeTint="80"/>
+          <w:sz w:val="20"/>
+          <w:szCs w:val="20"/>
+        </w:rPr>
+        <w:t>What did you do differently this time?</w:t>
+      </w:r>
+    </w:p>
+    <w:p>
+      <w:pPr>
+        <w:pStyle w:val="ListParagraph"/>
+        <w:rPr>
+          <w:color w:val="4C94D8" w:themeColor="text2" w:themeTint="80"/>
+          <w:sz w:val="20"/>
+          <w:szCs w:val="20"/>
+        </w:rPr>
+      </w:pPr>
+    </w:p>
+    <w:p>
+      <w:pPr>
+        <w:pStyle w:val="ListParagraph"/>
+        <w:rPr>
+          <w:color w:val="4C94D8" w:themeColor="text2" w:themeTint="80"/>
+          <w:sz w:val="20"/>
+          <w:szCs w:val="20"/>
+        </w:rPr>
+      </w:pPr>
+      <w:r>
+        <w:rPr>
+          <w:color w:val="4C94D8" w:themeColor="text2" w:themeTint="80"/>
+          <w:sz w:val="20"/>
+          <w:szCs w:val="20"/>
+          <w:highlight w:val="green"/>
+        </w:rPr>
+        <w:t>Unlike our 1st attempt, we ran a fresh 2nd 14-day closed test, shipped releases 4, 6 and 7 during testing, and fixed issues before re-applying. Added live JSON listings (n8n fallback) + offline cache. Shared APK with family/others; I validated each build on device.</w:t>
+      </w:r>
     </w:p>
     <w:sectPr>
       <w:pgSz w:w="12240" w:h="15840"/>

</xml_diff>